<commit_message>
updated trello board and doc
</commit_message>
<xml_diff>
--- a/docs/Iteration 1.docx
+++ b/docs/Iteration 1.docx
@@ -126,12 +126,6 @@
         <w:gridCol w:w="3000"/>
       </w:tblGrid>
       <w:tr>
-        <w:tblPrEx>
-          <w:tblCellMar>
-            <w:top w:w="0" w:type="dxa"/>
-            <w:bottom w:w="0" w:type="dxa"/>
-          </w:tblCellMar>
-        </w:tblPrEx>
         <w:tc>
           <w:tcPr>
             <w:tcW w:w="3000" w:type="dxa"/>
@@ -198,12 +192,6 @@
         </w:tc>
       </w:tr>
       <w:tr>
-        <w:tblPrEx>
-          <w:tblCellMar>
-            <w:top w:w="0" w:type="dxa"/>
-            <w:bottom w:w="0" w:type="dxa"/>
-          </w:tblCellMar>
-        </w:tblPrEx>
         <w:tc>
           <w:tcPr>
             <w:tcW w:w="3000" w:type="dxa"/>
@@ -258,12 +246,6 @@
         </w:tc>
       </w:tr>
       <w:tr>
-        <w:tblPrEx>
-          <w:tblCellMar>
-            <w:top w:w="0" w:type="dxa"/>
-            <w:bottom w:w="0" w:type="dxa"/>
-          </w:tblCellMar>
-        </w:tblPrEx>
         <w:tc>
           <w:tcPr>
             <w:tcW w:w="3000" w:type="dxa"/>
@@ -318,12 +300,6 @@
         </w:tc>
       </w:tr>
       <w:tr>
-        <w:tblPrEx>
-          <w:tblCellMar>
-            <w:top w:w="0" w:type="dxa"/>
-            <w:bottom w:w="0" w:type="dxa"/>
-          </w:tblCellMar>
-        </w:tblPrEx>
         <w:tc>
           <w:tcPr>
             <w:tcW w:w="3000" w:type="dxa"/>
@@ -619,12 +595,6 @@
         <w:gridCol w:w="2600"/>
       </w:tblGrid>
       <w:tr>
-        <w:tblPrEx>
-          <w:tblCellMar>
-            <w:top w:w="0" w:type="dxa"/>
-            <w:bottom w:w="0" w:type="dxa"/>
-          </w:tblCellMar>
-        </w:tblPrEx>
         <w:tc>
           <w:tcPr>
             <w:tcW w:w="720" w:type="dxa"/>
@@ -755,12 +725,6 @@
         </w:tc>
       </w:tr>
       <w:tr>
-        <w:tblPrEx>
-          <w:tblCellMar>
-            <w:top w:w="0" w:type="dxa"/>
-            <w:bottom w:w="0" w:type="dxa"/>
-          </w:tblCellMar>
-        </w:tblPrEx>
         <w:tc>
           <w:tcPr>
             <w:tcW w:w="720" w:type="dxa"/>
@@ -868,12 +832,6 @@
         </w:tc>
       </w:tr>
       <w:tr>
-        <w:tblPrEx>
-          <w:tblCellMar>
-            <w:top w:w="0" w:type="dxa"/>
-            <w:bottom w:w="0" w:type="dxa"/>
-          </w:tblCellMar>
-        </w:tblPrEx>
         <w:tc>
           <w:tcPr>
             <w:tcW w:w="720" w:type="dxa"/>
@@ -981,12 +939,6 @@
         </w:tc>
       </w:tr>
       <w:tr>
-        <w:tblPrEx>
-          <w:tblCellMar>
-            <w:top w:w="0" w:type="dxa"/>
-            <w:bottom w:w="0" w:type="dxa"/>
-          </w:tblCellMar>
-        </w:tblPrEx>
         <w:tc>
           <w:tcPr>
             <w:tcW w:w="720" w:type="dxa"/>
@@ -1094,12 +1046,6 @@
         </w:tc>
       </w:tr>
       <w:tr>
-        <w:tblPrEx>
-          <w:tblCellMar>
-            <w:top w:w="0" w:type="dxa"/>
-            <w:bottom w:w="0" w:type="dxa"/>
-          </w:tblCellMar>
-        </w:tblPrEx>
         <w:tc>
           <w:tcPr>
             <w:tcW w:w="720" w:type="dxa"/>
@@ -1207,12 +1153,6 @@
         </w:tc>
       </w:tr>
       <w:tr>
-        <w:tblPrEx>
-          <w:tblCellMar>
-            <w:top w:w="0" w:type="dxa"/>
-            <w:bottom w:w="0" w:type="dxa"/>
-          </w:tblCellMar>
-        </w:tblPrEx>
         <w:tc>
           <w:tcPr>
             <w:tcW w:w="720" w:type="dxa"/>
@@ -1372,12 +1312,6 @@
         <w:gridCol w:w="7160"/>
       </w:tblGrid>
       <w:tr>
-        <w:tblPrEx>
-          <w:tblCellMar>
-            <w:top w:w="0" w:type="dxa"/>
-            <w:bottom w:w="0" w:type="dxa"/>
-          </w:tblCellMar>
-        </w:tblPrEx>
         <w:tc>
           <w:tcPr>
             <w:tcW w:w="2200" w:type="dxa"/>
@@ -1444,12 +1378,6 @@
         </w:tc>
       </w:tr>
       <w:tr>
-        <w:tblPrEx>
-          <w:tblCellMar>
-            <w:top w:w="0" w:type="dxa"/>
-            <w:bottom w:w="0" w:type="dxa"/>
-          </w:tblCellMar>
-        </w:tblPrEx>
         <w:tc>
           <w:tcPr>
             <w:tcW w:w="2200" w:type="dxa"/>
@@ -1506,12 +1434,6 @@
         </w:tc>
       </w:tr>
       <w:tr>
-        <w:tblPrEx>
-          <w:tblCellMar>
-            <w:top w:w="0" w:type="dxa"/>
-            <w:bottom w:w="0" w:type="dxa"/>
-          </w:tblCellMar>
-        </w:tblPrEx>
         <w:tc>
           <w:tcPr>
             <w:tcW w:w="2200" w:type="dxa"/>
@@ -1582,12 +1504,6 @@
         </w:tc>
       </w:tr>
       <w:tr>
-        <w:tblPrEx>
-          <w:tblCellMar>
-            <w:top w:w="0" w:type="dxa"/>
-            <w:bottom w:w="0" w:type="dxa"/>
-          </w:tblCellMar>
-        </w:tblPrEx>
         <w:tc>
           <w:tcPr>
             <w:tcW w:w="2200" w:type="dxa"/>
@@ -1644,12 +1560,6 @@
         </w:tc>
       </w:tr>
       <w:tr>
-        <w:tblPrEx>
-          <w:tblCellMar>
-            <w:top w:w="0" w:type="dxa"/>
-            <w:bottom w:w="0" w:type="dxa"/>
-          </w:tblCellMar>
-        </w:tblPrEx>
         <w:tc>
           <w:tcPr>
             <w:tcW w:w="2200" w:type="dxa"/>
@@ -1706,12 +1616,6 @@
         </w:tc>
       </w:tr>
       <w:tr>
-        <w:tblPrEx>
-          <w:tblCellMar>
-            <w:top w:w="0" w:type="dxa"/>
-            <w:bottom w:w="0" w:type="dxa"/>
-          </w:tblCellMar>
-        </w:tblPrEx>
         <w:tc>
           <w:tcPr>
             <w:tcW w:w="2200" w:type="dxa"/>
@@ -1782,12 +1686,6 @@
         </w:tc>
       </w:tr>
       <w:tr>
-        <w:tblPrEx>
-          <w:tblCellMar>
-            <w:top w:w="0" w:type="dxa"/>
-            <w:bottom w:w="0" w:type="dxa"/>
-          </w:tblCellMar>
-        </w:tblPrEx>
         <w:tc>
           <w:tcPr>
             <w:tcW w:w="2200" w:type="dxa"/>
@@ -1844,12 +1742,6 @@
         </w:tc>
       </w:tr>
       <w:tr>
-        <w:tblPrEx>
-          <w:tblCellMar>
-            <w:top w:w="0" w:type="dxa"/>
-            <w:bottom w:w="0" w:type="dxa"/>
-          </w:tblCellMar>
-        </w:tblPrEx>
         <w:tc>
           <w:tcPr>
             <w:tcW w:w="2200" w:type="dxa"/>
@@ -1944,12 +1836,6 @@
         <w:gridCol w:w="5360"/>
       </w:tblGrid>
       <w:tr>
-        <w:tblPrEx>
-          <w:tblCellMar>
-            <w:top w:w="0" w:type="dxa"/>
-            <w:bottom w:w="0" w:type="dxa"/>
-          </w:tblCellMar>
-        </w:tblPrEx>
         <w:tc>
           <w:tcPr>
             <w:tcW w:w="1600" w:type="dxa"/>
@@ -2048,12 +1934,6 @@
         </w:tc>
       </w:tr>
       <w:tr>
-        <w:tblPrEx>
-          <w:tblCellMar>
-            <w:top w:w="0" w:type="dxa"/>
-            <w:bottom w:w="0" w:type="dxa"/>
-          </w:tblCellMar>
-        </w:tblPrEx>
         <w:tc>
           <w:tcPr>
             <w:tcW w:w="1600" w:type="dxa"/>
@@ -2134,12 +2014,6 @@
         </w:tc>
       </w:tr>
       <w:tr>
-        <w:tblPrEx>
-          <w:tblCellMar>
-            <w:top w:w="0" w:type="dxa"/>
-            <w:bottom w:w="0" w:type="dxa"/>
-          </w:tblCellMar>
-        </w:tblPrEx>
         <w:tc>
           <w:tcPr>
             <w:tcW w:w="1600" w:type="dxa"/>
@@ -2220,12 +2094,6 @@
         </w:tc>
       </w:tr>
       <w:tr>
-        <w:tblPrEx>
-          <w:tblCellMar>
-            <w:top w:w="0" w:type="dxa"/>
-            <w:bottom w:w="0" w:type="dxa"/>
-          </w:tblCellMar>
-        </w:tblPrEx>
         <w:tc>
           <w:tcPr>
             <w:tcW w:w="1600" w:type="dxa"/>
@@ -2306,12 +2174,6 @@
         </w:tc>
       </w:tr>
       <w:tr>
-        <w:tblPrEx>
-          <w:tblCellMar>
-            <w:top w:w="0" w:type="dxa"/>
-            <w:bottom w:w="0" w:type="dxa"/>
-          </w:tblCellMar>
-        </w:tblPrEx>
         <w:tc>
           <w:tcPr>
             <w:tcW w:w="1600" w:type="dxa"/>
@@ -2427,12 +2289,6 @@
         <w:gridCol w:w="7160"/>
       </w:tblGrid>
       <w:tr>
-        <w:tblPrEx>
-          <w:tblCellMar>
-            <w:top w:w="0" w:type="dxa"/>
-            <w:bottom w:w="0" w:type="dxa"/>
-          </w:tblCellMar>
-        </w:tblPrEx>
         <w:tc>
           <w:tcPr>
             <w:tcW w:w="2200" w:type="dxa"/>
@@ -2499,12 +2355,6 @@
         </w:tc>
       </w:tr>
       <w:tr>
-        <w:tblPrEx>
-          <w:tblCellMar>
-            <w:top w:w="0" w:type="dxa"/>
-            <w:bottom w:w="0" w:type="dxa"/>
-          </w:tblCellMar>
-        </w:tblPrEx>
         <w:tc>
           <w:tcPr>
             <w:tcW w:w="2200" w:type="dxa"/>
@@ -2561,12 +2411,6 @@
         </w:tc>
       </w:tr>
       <w:tr>
-        <w:tblPrEx>
-          <w:tblCellMar>
-            <w:top w:w="0" w:type="dxa"/>
-            <w:bottom w:w="0" w:type="dxa"/>
-          </w:tblCellMar>
-        </w:tblPrEx>
         <w:tc>
           <w:tcPr>
             <w:tcW w:w="2200" w:type="dxa"/>
@@ -2623,12 +2467,6 @@
         </w:tc>
       </w:tr>
       <w:tr>
-        <w:tblPrEx>
-          <w:tblCellMar>
-            <w:top w:w="0" w:type="dxa"/>
-            <w:bottom w:w="0" w:type="dxa"/>
-          </w:tblCellMar>
-        </w:tblPrEx>
         <w:tc>
           <w:tcPr>
             <w:tcW w:w="2200" w:type="dxa"/>
@@ -2686,12 +2524,6 @@
         </w:tc>
       </w:tr>
       <w:tr>
-        <w:tblPrEx>
-          <w:tblCellMar>
-            <w:top w:w="0" w:type="dxa"/>
-            <w:bottom w:w="0" w:type="dxa"/>
-          </w:tblCellMar>
-        </w:tblPrEx>
         <w:tc>
           <w:tcPr>
             <w:tcW w:w="2200" w:type="dxa"/>
@@ -2748,12 +2580,6 @@
         </w:tc>
       </w:tr>
       <w:tr>
-        <w:tblPrEx>
-          <w:tblCellMar>
-            <w:top w:w="0" w:type="dxa"/>
-            <w:bottom w:w="0" w:type="dxa"/>
-          </w:tblCellMar>
-        </w:tblPrEx>
         <w:tc>
           <w:tcPr>
             <w:tcW w:w="2200" w:type="dxa"/>
@@ -2810,12 +2636,6 @@
         </w:tc>
       </w:tr>
       <w:tr>
-        <w:tblPrEx>
-          <w:tblCellMar>
-            <w:top w:w="0" w:type="dxa"/>
-            <w:bottom w:w="0" w:type="dxa"/>
-          </w:tblCellMar>
-        </w:tblPrEx>
         <w:tc>
           <w:tcPr>
             <w:tcW w:w="2200" w:type="dxa"/>
@@ -2872,12 +2692,6 @@
         </w:tc>
       </w:tr>
       <w:tr>
-        <w:tblPrEx>
-          <w:tblCellMar>
-            <w:top w:w="0" w:type="dxa"/>
-            <w:bottom w:w="0" w:type="dxa"/>
-          </w:tblCellMar>
-        </w:tblPrEx>
         <w:tc>
           <w:tcPr>
             <w:tcW w:w="2200" w:type="dxa"/>
@@ -2972,12 +2786,6 @@
         <w:gridCol w:w="5160"/>
       </w:tblGrid>
       <w:tr>
-        <w:tblPrEx>
-          <w:tblCellMar>
-            <w:top w:w="0" w:type="dxa"/>
-            <w:bottom w:w="0" w:type="dxa"/>
-          </w:tblCellMar>
-        </w:tblPrEx>
         <w:tc>
           <w:tcPr>
             <w:tcW w:w="1600" w:type="dxa"/>
@@ -3076,12 +2884,6 @@
         </w:tc>
       </w:tr>
       <w:tr>
-        <w:tblPrEx>
-          <w:tblCellMar>
-            <w:top w:w="0" w:type="dxa"/>
-            <w:bottom w:w="0" w:type="dxa"/>
-          </w:tblCellMar>
-        </w:tblPrEx>
         <w:tc>
           <w:tcPr>
             <w:tcW w:w="1600" w:type="dxa"/>
@@ -3162,12 +2964,6 @@
         </w:tc>
       </w:tr>
       <w:tr>
-        <w:tblPrEx>
-          <w:tblCellMar>
-            <w:top w:w="0" w:type="dxa"/>
-            <w:bottom w:w="0" w:type="dxa"/>
-          </w:tblCellMar>
-        </w:tblPrEx>
         <w:tc>
           <w:tcPr>
             <w:tcW w:w="1600" w:type="dxa"/>
@@ -3248,12 +3044,6 @@
         </w:tc>
       </w:tr>
       <w:tr>
-        <w:tblPrEx>
-          <w:tblCellMar>
-            <w:top w:w="0" w:type="dxa"/>
-            <w:bottom w:w="0" w:type="dxa"/>
-          </w:tblCellMar>
-        </w:tblPrEx>
         <w:tc>
           <w:tcPr>
             <w:tcW w:w="1600" w:type="dxa"/>
@@ -3334,12 +3124,6 @@
         </w:tc>
       </w:tr>
       <w:tr>
-        <w:tblPrEx>
-          <w:tblCellMar>
-            <w:top w:w="0" w:type="dxa"/>
-            <w:bottom w:w="0" w:type="dxa"/>
-          </w:tblCellMar>
-        </w:tblPrEx>
         <w:tc>
           <w:tcPr>
             <w:tcW w:w="1600" w:type="dxa"/>
@@ -3455,12 +3239,6 @@
         <w:gridCol w:w="7160"/>
       </w:tblGrid>
       <w:tr>
-        <w:tblPrEx>
-          <w:tblCellMar>
-            <w:top w:w="0" w:type="dxa"/>
-            <w:bottom w:w="0" w:type="dxa"/>
-          </w:tblCellMar>
-        </w:tblPrEx>
         <w:tc>
           <w:tcPr>
             <w:tcW w:w="2200" w:type="dxa"/>
@@ -3527,12 +3305,6 @@
         </w:tc>
       </w:tr>
       <w:tr>
-        <w:tblPrEx>
-          <w:tblCellMar>
-            <w:top w:w="0" w:type="dxa"/>
-            <w:bottom w:w="0" w:type="dxa"/>
-          </w:tblCellMar>
-        </w:tblPrEx>
         <w:tc>
           <w:tcPr>
             <w:tcW w:w="2200" w:type="dxa"/>
@@ -3589,12 +3361,6 @@
         </w:tc>
       </w:tr>
       <w:tr>
-        <w:tblPrEx>
-          <w:tblCellMar>
-            <w:top w:w="0" w:type="dxa"/>
-            <w:bottom w:w="0" w:type="dxa"/>
-          </w:tblCellMar>
-        </w:tblPrEx>
         <w:tc>
           <w:tcPr>
             <w:tcW w:w="2200" w:type="dxa"/>
@@ -3651,12 +3417,6 @@
         </w:tc>
       </w:tr>
       <w:tr>
-        <w:tblPrEx>
-          <w:tblCellMar>
-            <w:top w:w="0" w:type="dxa"/>
-            <w:bottom w:w="0" w:type="dxa"/>
-          </w:tblCellMar>
-        </w:tblPrEx>
         <w:tc>
           <w:tcPr>
             <w:tcW w:w="2200" w:type="dxa"/>
@@ -3713,12 +3473,6 @@
         </w:tc>
       </w:tr>
       <w:tr>
-        <w:tblPrEx>
-          <w:tblCellMar>
-            <w:top w:w="0" w:type="dxa"/>
-            <w:bottom w:w="0" w:type="dxa"/>
-          </w:tblCellMar>
-        </w:tblPrEx>
         <w:tc>
           <w:tcPr>
             <w:tcW w:w="2200" w:type="dxa"/>
@@ -3775,12 +3529,6 @@
         </w:tc>
       </w:tr>
       <w:tr>
-        <w:tblPrEx>
-          <w:tblCellMar>
-            <w:top w:w="0" w:type="dxa"/>
-            <w:bottom w:w="0" w:type="dxa"/>
-          </w:tblCellMar>
-        </w:tblPrEx>
         <w:tc>
           <w:tcPr>
             <w:tcW w:w="2200" w:type="dxa"/>
@@ -3844,12 +3592,6 @@
         </w:tc>
       </w:tr>
       <w:tr>
-        <w:tblPrEx>
-          <w:tblCellMar>
-            <w:top w:w="0" w:type="dxa"/>
-            <w:bottom w:w="0" w:type="dxa"/>
-          </w:tblCellMar>
-        </w:tblPrEx>
         <w:tc>
           <w:tcPr>
             <w:tcW w:w="2200" w:type="dxa"/>
@@ -3907,12 +3649,6 @@
         </w:tc>
       </w:tr>
       <w:tr>
-        <w:tblPrEx>
-          <w:tblCellMar>
-            <w:top w:w="0" w:type="dxa"/>
-            <w:bottom w:w="0" w:type="dxa"/>
-          </w:tblCellMar>
-        </w:tblPrEx>
         <w:tc>
           <w:tcPr>
             <w:tcW w:w="2200" w:type="dxa"/>
@@ -4007,12 +3743,6 @@
         <w:gridCol w:w="5160"/>
       </w:tblGrid>
       <w:tr>
-        <w:tblPrEx>
-          <w:tblCellMar>
-            <w:top w:w="0" w:type="dxa"/>
-            <w:bottom w:w="0" w:type="dxa"/>
-          </w:tblCellMar>
-        </w:tblPrEx>
         <w:tc>
           <w:tcPr>
             <w:tcW w:w="1600" w:type="dxa"/>
@@ -4111,12 +3841,6 @@
         </w:tc>
       </w:tr>
       <w:tr>
-        <w:tblPrEx>
-          <w:tblCellMar>
-            <w:top w:w="0" w:type="dxa"/>
-            <w:bottom w:w="0" w:type="dxa"/>
-          </w:tblCellMar>
-        </w:tblPrEx>
         <w:tc>
           <w:tcPr>
             <w:tcW w:w="1600" w:type="dxa"/>
@@ -4197,12 +3921,6 @@
         </w:tc>
       </w:tr>
       <w:tr>
-        <w:tblPrEx>
-          <w:tblCellMar>
-            <w:top w:w="0" w:type="dxa"/>
-            <w:bottom w:w="0" w:type="dxa"/>
-          </w:tblCellMar>
-        </w:tblPrEx>
         <w:tc>
           <w:tcPr>
             <w:tcW w:w="1600" w:type="dxa"/>
@@ -4283,12 +4001,6 @@
         </w:tc>
       </w:tr>
       <w:tr>
-        <w:tblPrEx>
-          <w:tblCellMar>
-            <w:top w:w="0" w:type="dxa"/>
-            <w:bottom w:w="0" w:type="dxa"/>
-          </w:tblCellMar>
-        </w:tblPrEx>
         <w:tc>
           <w:tcPr>
             <w:tcW w:w="1600" w:type="dxa"/>
@@ -4369,12 +4081,6 @@
         </w:tc>
       </w:tr>
       <w:tr>
-        <w:tblPrEx>
-          <w:tblCellMar>
-            <w:top w:w="0" w:type="dxa"/>
-            <w:bottom w:w="0" w:type="dxa"/>
-          </w:tblCellMar>
-        </w:tblPrEx>
         <w:tc>
           <w:tcPr>
             <w:tcW w:w="1600" w:type="dxa"/>
@@ -4490,12 +4196,6 @@
         <w:gridCol w:w="7160"/>
       </w:tblGrid>
       <w:tr>
-        <w:tblPrEx>
-          <w:tblCellMar>
-            <w:top w:w="0" w:type="dxa"/>
-            <w:bottom w:w="0" w:type="dxa"/>
-          </w:tblCellMar>
-        </w:tblPrEx>
         <w:tc>
           <w:tcPr>
             <w:tcW w:w="2200" w:type="dxa"/>
@@ -4562,12 +4262,6 @@
         </w:tc>
       </w:tr>
       <w:tr>
-        <w:tblPrEx>
-          <w:tblCellMar>
-            <w:top w:w="0" w:type="dxa"/>
-            <w:bottom w:w="0" w:type="dxa"/>
-          </w:tblCellMar>
-        </w:tblPrEx>
         <w:tc>
           <w:tcPr>
             <w:tcW w:w="2200" w:type="dxa"/>
@@ -4624,12 +4318,6 @@
         </w:tc>
       </w:tr>
       <w:tr>
-        <w:tblPrEx>
-          <w:tblCellMar>
-            <w:top w:w="0" w:type="dxa"/>
-            <w:bottom w:w="0" w:type="dxa"/>
-          </w:tblCellMar>
-        </w:tblPrEx>
         <w:tc>
           <w:tcPr>
             <w:tcW w:w="2200" w:type="dxa"/>
@@ -4686,12 +4374,6 @@
         </w:tc>
       </w:tr>
       <w:tr>
-        <w:tblPrEx>
-          <w:tblCellMar>
-            <w:top w:w="0" w:type="dxa"/>
-            <w:bottom w:w="0" w:type="dxa"/>
-          </w:tblCellMar>
-        </w:tblPrEx>
         <w:tc>
           <w:tcPr>
             <w:tcW w:w="2200" w:type="dxa"/>
@@ -4748,12 +4430,6 @@
         </w:tc>
       </w:tr>
       <w:tr>
-        <w:tblPrEx>
-          <w:tblCellMar>
-            <w:top w:w="0" w:type="dxa"/>
-            <w:bottom w:w="0" w:type="dxa"/>
-          </w:tblCellMar>
-        </w:tblPrEx>
         <w:tc>
           <w:tcPr>
             <w:tcW w:w="2200" w:type="dxa"/>
@@ -4810,12 +4486,6 @@
         </w:tc>
       </w:tr>
       <w:tr>
-        <w:tblPrEx>
-          <w:tblCellMar>
-            <w:top w:w="0" w:type="dxa"/>
-            <w:bottom w:w="0" w:type="dxa"/>
-          </w:tblCellMar>
-        </w:tblPrEx>
         <w:tc>
           <w:tcPr>
             <w:tcW w:w="2200" w:type="dxa"/>
@@ -4872,12 +4542,6 @@
         </w:tc>
       </w:tr>
       <w:tr>
-        <w:tblPrEx>
-          <w:tblCellMar>
-            <w:top w:w="0" w:type="dxa"/>
-            <w:bottom w:w="0" w:type="dxa"/>
-          </w:tblCellMar>
-        </w:tblPrEx>
         <w:tc>
           <w:tcPr>
             <w:tcW w:w="2200" w:type="dxa"/>
@@ -4934,12 +4598,6 @@
         </w:tc>
       </w:tr>
       <w:tr>
-        <w:tblPrEx>
-          <w:tblCellMar>
-            <w:top w:w="0" w:type="dxa"/>
-            <w:bottom w:w="0" w:type="dxa"/>
-          </w:tblCellMar>
-        </w:tblPrEx>
         <w:tc>
           <w:tcPr>
             <w:tcW w:w="2200" w:type="dxa"/>
@@ -5034,12 +4692,6 @@
         <w:gridCol w:w="5160"/>
       </w:tblGrid>
       <w:tr>
-        <w:tblPrEx>
-          <w:tblCellMar>
-            <w:top w:w="0" w:type="dxa"/>
-            <w:bottom w:w="0" w:type="dxa"/>
-          </w:tblCellMar>
-        </w:tblPrEx>
         <w:tc>
           <w:tcPr>
             <w:tcW w:w="1600" w:type="dxa"/>
@@ -5138,12 +4790,6 @@
         </w:tc>
       </w:tr>
       <w:tr>
-        <w:tblPrEx>
-          <w:tblCellMar>
-            <w:top w:w="0" w:type="dxa"/>
-            <w:bottom w:w="0" w:type="dxa"/>
-          </w:tblCellMar>
-        </w:tblPrEx>
         <w:tc>
           <w:tcPr>
             <w:tcW w:w="1600" w:type="dxa"/>
@@ -5225,12 +4871,6 @@
         </w:tc>
       </w:tr>
       <w:tr>
-        <w:tblPrEx>
-          <w:tblCellMar>
-            <w:top w:w="0" w:type="dxa"/>
-            <w:bottom w:w="0" w:type="dxa"/>
-          </w:tblCellMar>
-        </w:tblPrEx>
         <w:tc>
           <w:tcPr>
             <w:tcW w:w="1600" w:type="dxa"/>
@@ -5311,12 +4951,6 @@
         </w:tc>
       </w:tr>
       <w:tr>
-        <w:tblPrEx>
-          <w:tblCellMar>
-            <w:top w:w="0" w:type="dxa"/>
-            <w:bottom w:w="0" w:type="dxa"/>
-          </w:tblCellMar>
-        </w:tblPrEx>
         <w:tc>
           <w:tcPr>
             <w:tcW w:w="1600" w:type="dxa"/>
@@ -5397,12 +5031,6 @@
         </w:tc>
       </w:tr>
       <w:tr>
-        <w:tblPrEx>
-          <w:tblCellMar>
-            <w:top w:w="0" w:type="dxa"/>
-            <w:bottom w:w="0" w:type="dxa"/>
-          </w:tblCellMar>
-        </w:tblPrEx>
         <w:tc>
           <w:tcPr>
             <w:tcW w:w="1600" w:type="dxa"/>
@@ -5518,12 +5146,6 @@
         <w:gridCol w:w="7160"/>
       </w:tblGrid>
       <w:tr>
-        <w:tblPrEx>
-          <w:tblCellMar>
-            <w:top w:w="0" w:type="dxa"/>
-            <w:bottom w:w="0" w:type="dxa"/>
-          </w:tblCellMar>
-        </w:tblPrEx>
         <w:tc>
           <w:tcPr>
             <w:tcW w:w="2200" w:type="dxa"/>
@@ -5590,12 +5212,6 @@
         </w:tc>
       </w:tr>
       <w:tr>
-        <w:tblPrEx>
-          <w:tblCellMar>
-            <w:top w:w="0" w:type="dxa"/>
-            <w:bottom w:w="0" w:type="dxa"/>
-          </w:tblCellMar>
-        </w:tblPrEx>
         <w:tc>
           <w:tcPr>
             <w:tcW w:w="2200" w:type="dxa"/>
@@ -5652,12 +5268,6 @@
         </w:tc>
       </w:tr>
       <w:tr>
-        <w:tblPrEx>
-          <w:tblCellMar>
-            <w:top w:w="0" w:type="dxa"/>
-            <w:bottom w:w="0" w:type="dxa"/>
-          </w:tblCellMar>
-        </w:tblPrEx>
         <w:tc>
           <w:tcPr>
             <w:tcW w:w="2200" w:type="dxa"/>
@@ -5714,12 +5324,6 @@
         </w:tc>
       </w:tr>
       <w:tr>
-        <w:tblPrEx>
-          <w:tblCellMar>
-            <w:top w:w="0" w:type="dxa"/>
-            <w:bottom w:w="0" w:type="dxa"/>
-          </w:tblCellMar>
-        </w:tblPrEx>
         <w:tc>
           <w:tcPr>
             <w:tcW w:w="2200" w:type="dxa"/>
@@ -5776,12 +5380,6 @@
         </w:tc>
       </w:tr>
       <w:tr>
-        <w:tblPrEx>
-          <w:tblCellMar>
-            <w:top w:w="0" w:type="dxa"/>
-            <w:bottom w:w="0" w:type="dxa"/>
-          </w:tblCellMar>
-        </w:tblPrEx>
         <w:tc>
           <w:tcPr>
             <w:tcW w:w="2200" w:type="dxa"/>
@@ -5838,12 +5436,6 @@
         </w:tc>
       </w:tr>
       <w:tr>
-        <w:tblPrEx>
-          <w:tblCellMar>
-            <w:top w:w="0" w:type="dxa"/>
-            <w:bottom w:w="0" w:type="dxa"/>
-          </w:tblCellMar>
-        </w:tblPrEx>
         <w:tc>
           <w:tcPr>
             <w:tcW w:w="2200" w:type="dxa"/>
@@ -5900,12 +5492,6 @@
         </w:tc>
       </w:tr>
       <w:tr>
-        <w:tblPrEx>
-          <w:tblCellMar>
-            <w:top w:w="0" w:type="dxa"/>
-            <w:bottom w:w="0" w:type="dxa"/>
-          </w:tblCellMar>
-        </w:tblPrEx>
         <w:tc>
           <w:tcPr>
             <w:tcW w:w="2200" w:type="dxa"/>
@@ -5962,12 +5548,6 @@
         </w:tc>
       </w:tr>
       <w:tr>
-        <w:tblPrEx>
-          <w:tblCellMar>
-            <w:top w:w="0" w:type="dxa"/>
-            <w:bottom w:w="0" w:type="dxa"/>
-          </w:tblCellMar>
-        </w:tblPrEx>
         <w:tc>
           <w:tcPr>
             <w:tcW w:w="2200" w:type="dxa"/>
@@ -6062,12 +5642,6 @@
         <w:gridCol w:w="5160"/>
       </w:tblGrid>
       <w:tr>
-        <w:tblPrEx>
-          <w:tblCellMar>
-            <w:top w:w="0" w:type="dxa"/>
-            <w:bottom w:w="0" w:type="dxa"/>
-          </w:tblCellMar>
-        </w:tblPrEx>
         <w:tc>
           <w:tcPr>
             <w:tcW w:w="1600" w:type="dxa"/>
@@ -6166,12 +5740,6 @@
         </w:tc>
       </w:tr>
       <w:tr>
-        <w:tblPrEx>
-          <w:tblCellMar>
-            <w:top w:w="0" w:type="dxa"/>
-            <w:bottom w:w="0" w:type="dxa"/>
-          </w:tblCellMar>
-        </w:tblPrEx>
         <w:tc>
           <w:tcPr>
             <w:tcW w:w="1600" w:type="dxa"/>
@@ -6252,12 +5820,6 @@
         </w:tc>
       </w:tr>
       <w:tr>
-        <w:tblPrEx>
-          <w:tblCellMar>
-            <w:top w:w="0" w:type="dxa"/>
-            <w:bottom w:w="0" w:type="dxa"/>
-          </w:tblCellMar>
-        </w:tblPrEx>
         <w:tc>
           <w:tcPr>
             <w:tcW w:w="1600" w:type="dxa"/>
@@ -6338,12 +5900,6 @@
         </w:tc>
       </w:tr>
       <w:tr>
-        <w:tblPrEx>
-          <w:tblCellMar>
-            <w:top w:w="0" w:type="dxa"/>
-            <w:bottom w:w="0" w:type="dxa"/>
-          </w:tblCellMar>
-        </w:tblPrEx>
         <w:tc>
           <w:tcPr>
             <w:tcW w:w="1600" w:type="dxa"/>
@@ -6424,12 +5980,6 @@
         </w:tc>
       </w:tr>
       <w:tr>
-        <w:tblPrEx>
-          <w:tblCellMar>
-            <w:top w:w="0" w:type="dxa"/>
-            <w:bottom w:w="0" w:type="dxa"/>
-          </w:tblCellMar>
-        </w:tblPrEx>
         <w:tc>
           <w:tcPr>
             <w:tcW w:w="1600" w:type="dxa"/>
@@ -6574,12 +6124,6 @@
         <w:gridCol w:w="6760"/>
       </w:tblGrid>
       <w:tr>
-        <w:tblPrEx>
-          <w:tblCellMar>
-            <w:top w:w="0" w:type="dxa"/>
-            <w:bottom w:w="0" w:type="dxa"/>
-          </w:tblCellMar>
-        </w:tblPrEx>
         <w:tc>
           <w:tcPr>
             <w:tcW w:w="2600" w:type="dxa"/>
@@ -6646,12 +6190,6 @@
         </w:tc>
       </w:tr>
       <w:tr>
-        <w:tblPrEx>
-          <w:tblCellMar>
-            <w:top w:w="0" w:type="dxa"/>
-            <w:bottom w:w="0" w:type="dxa"/>
-          </w:tblCellMar>
-        </w:tblPrEx>
         <w:tc>
           <w:tcPr>
             <w:tcW w:w="2600" w:type="dxa"/>
@@ -6708,12 +6246,6 @@
         </w:tc>
       </w:tr>
       <w:tr>
-        <w:tblPrEx>
-          <w:tblCellMar>
-            <w:top w:w="0" w:type="dxa"/>
-            <w:bottom w:w="0" w:type="dxa"/>
-          </w:tblCellMar>
-        </w:tblPrEx>
         <w:tc>
           <w:tcPr>
             <w:tcW w:w="2600" w:type="dxa"/>
@@ -6770,12 +6302,6 @@
         </w:tc>
       </w:tr>
       <w:tr>
-        <w:tblPrEx>
-          <w:tblCellMar>
-            <w:top w:w="0" w:type="dxa"/>
-            <w:bottom w:w="0" w:type="dxa"/>
-          </w:tblCellMar>
-        </w:tblPrEx>
         <w:tc>
           <w:tcPr>
             <w:tcW w:w="2600" w:type="dxa"/>
@@ -6832,12 +6358,6 @@
         </w:tc>
       </w:tr>
       <w:tr>
-        <w:tblPrEx>
-          <w:tblCellMar>
-            <w:top w:w="0" w:type="dxa"/>
-            <w:bottom w:w="0" w:type="dxa"/>
-          </w:tblCellMar>
-        </w:tblPrEx>
         <w:tc>
           <w:tcPr>
             <w:tcW w:w="2600" w:type="dxa"/>
@@ -6922,12 +6442,6 @@
         </w:tc>
       </w:tr>
       <w:tr>
-        <w:tblPrEx>
-          <w:tblCellMar>
-            <w:top w:w="0" w:type="dxa"/>
-            <w:bottom w:w="0" w:type="dxa"/>
-          </w:tblCellMar>
-        </w:tblPrEx>
         <w:tc>
           <w:tcPr>
             <w:tcW w:w="2600" w:type="dxa"/>
@@ -6984,12 +6498,6 @@
         </w:tc>
       </w:tr>
       <w:tr>
-        <w:tblPrEx>
-          <w:tblCellMar>
-            <w:top w:w="0" w:type="dxa"/>
-            <w:bottom w:w="0" w:type="dxa"/>
-          </w:tblCellMar>
-        </w:tblPrEx>
         <w:tc>
           <w:tcPr>
             <w:tcW w:w="2600" w:type="dxa"/>
@@ -7060,12 +6568,6 @@
         </w:tc>
       </w:tr>
       <w:tr>
-        <w:tblPrEx>
-          <w:tblCellMar>
-            <w:top w:w="0" w:type="dxa"/>
-            <w:bottom w:w="0" w:type="dxa"/>
-          </w:tblCellMar>
-        </w:tblPrEx>
         <w:tc>
           <w:tcPr>
             <w:tcW w:w="2600" w:type="dxa"/>
@@ -7122,12 +6624,6 @@
         </w:tc>
       </w:tr>
       <w:tr>
-        <w:tblPrEx>
-          <w:tblCellMar>
-            <w:top w:w="0" w:type="dxa"/>
-            <w:bottom w:w="0" w:type="dxa"/>
-          </w:tblCellMar>
-        </w:tblPrEx>
         <w:tc>
           <w:tcPr>
             <w:tcW w:w="2600" w:type="dxa"/>
@@ -7198,12 +6694,6 @@
         </w:tc>
       </w:tr>
       <w:tr>
-        <w:tblPrEx>
-          <w:tblCellMar>
-            <w:top w:w="0" w:type="dxa"/>
-            <w:bottom w:w="0" w:type="dxa"/>
-          </w:tblCellMar>
-        </w:tblPrEx>
         <w:tc>
           <w:tcPr>
             <w:tcW w:w="2600" w:type="dxa"/>
@@ -7260,12 +6750,6 @@
         </w:tc>
       </w:tr>
       <w:tr>
-        <w:tblPrEx>
-          <w:tblCellMar>
-            <w:top w:w="0" w:type="dxa"/>
-            <w:bottom w:w="0" w:type="dxa"/>
-          </w:tblCellMar>
-        </w:tblPrEx>
         <w:tc>
           <w:tcPr>
             <w:tcW w:w="2600" w:type="dxa"/>
@@ -7371,12 +6855,6 @@
         <w:gridCol w:w="6760"/>
       </w:tblGrid>
       <w:tr>
-        <w:tblPrEx>
-          <w:tblCellMar>
-            <w:top w:w="0" w:type="dxa"/>
-            <w:bottom w:w="0" w:type="dxa"/>
-          </w:tblCellMar>
-        </w:tblPrEx>
         <w:tc>
           <w:tcPr>
             <w:tcW w:w="2600" w:type="dxa"/>
@@ -7443,12 +6921,6 @@
         </w:tc>
       </w:tr>
       <w:tr>
-        <w:tblPrEx>
-          <w:tblCellMar>
-            <w:top w:w="0" w:type="dxa"/>
-            <w:bottom w:w="0" w:type="dxa"/>
-          </w:tblCellMar>
-        </w:tblPrEx>
         <w:tc>
           <w:tcPr>
             <w:tcW w:w="2600" w:type="dxa"/>
@@ -7505,12 +6977,6 @@
         </w:tc>
       </w:tr>
       <w:tr>
-        <w:tblPrEx>
-          <w:tblCellMar>
-            <w:top w:w="0" w:type="dxa"/>
-            <w:bottom w:w="0" w:type="dxa"/>
-          </w:tblCellMar>
-        </w:tblPrEx>
         <w:tc>
           <w:tcPr>
             <w:tcW w:w="2600" w:type="dxa"/>
@@ -7567,12 +7033,6 @@
         </w:tc>
       </w:tr>
       <w:tr>
-        <w:tblPrEx>
-          <w:tblCellMar>
-            <w:top w:w="0" w:type="dxa"/>
-            <w:bottom w:w="0" w:type="dxa"/>
-          </w:tblCellMar>
-        </w:tblPrEx>
         <w:tc>
           <w:tcPr>
             <w:tcW w:w="2600" w:type="dxa"/>
@@ -7630,12 +7090,6 @@
         </w:tc>
       </w:tr>
       <w:tr>
-        <w:tblPrEx>
-          <w:tblCellMar>
-            <w:top w:w="0" w:type="dxa"/>
-            <w:bottom w:w="0" w:type="dxa"/>
-          </w:tblCellMar>
-        </w:tblPrEx>
         <w:tc>
           <w:tcPr>
             <w:tcW w:w="2600" w:type="dxa"/>
@@ -7692,12 +7146,6 @@
         </w:tc>
       </w:tr>
       <w:tr>
-        <w:tblPrEx>
-          <w:tblCellMar>
-            <w:top w:w="0" w:type="dxa"/>
-            <w:bottom w:w="0" w:type="dxa"/>
-          </w:tblCellMar>
-        </w:tblPrEx>
         <w:tc>
           <w:tcPr>
             <w:tcW w:w="2600" w:type="dxa"/>
@@ -7754,12 +7202,6 @@
         </w:tc>
       </w:tr>
       <w:tr>
-        <w:tblPrEx>
-          <w:tblCellMar>
-            <w:top w:w="0" w:type="dxa"/>
-            <w:bottom w:w="0" w:type="dxa"/>
-          </w:tblCellMar>
-        </w:tblPrEx>
         <w:tc>
           <w:tcPr>
             <w:tcW w:w="2600" w:type="dxa"/>
@@ -7816,12 +7258,6 @@
         </w:tc>
       </w:tr>
       <w:tr>
-        <w:tblPrEx>
-          <w:tblCellMar>
-            <w:top w:w="0" w:type="dxa"/>
-            <w:bottom w:w="0" w:type="dxa"/>
-          </w:tblCellMar>
-        </w:tblPrEx>
         <w:tc>
           <w:tcPr>
             <w:tcW w:w="2600" w:type="dxa"/>
@@ -7878,12 +7314,6 @@
         </w:tc>
       </w:tr>
       <w:tr>
-        <w:tblPrEx>
-          <w:tblCellMar>
-            <w:top w:w="0" w:type="dxa"/>
-            <w:bottom w:w="0" w:type="dxa"/>
-          </w:tblCellMar>
-        </w:tblPrEx>
         <w:tc>
           <w:tcPr>
             <w:tcW w:w="2600" w:type="dxa"/>
@@ -7940,12 +7370,6 @@
         </w:tc>
       </w:tr>
       <w:tr>
-        <w:tblPrEx>
-          <w:tblCellMar>
-            <w:top w:w="0" w:type="dxa"/>
-            <w:bottom w:w="0" w:type="dxa"/>
-          </w:tblCellMar>
-        </w:tblPrEx>
         <w:tc>
           <w:tcPr>
             <w:tcW w:w="2600" w:type="dxa"/>
@@ -8002,12 +7426,6 @@
         </w:tc>
       </w:tr>
       <w:tr>
-        <w:tblPrEx>
-          <w:tblCellMar>
-            <w:top w:w="0" w:type="dxa"/>
-            <w:bottom w:w="0" w:type="dxa"/>
-          </w:tblCellMar>
-        </w:tblPrEx>
         <w:tc>
           <w:tcPr>
             <w:tcW w:w="2600" w:type="dxa"/>
@@ -8099,12 +7517,6 @@
         <w:gridCol w:w="6760"/>
       </w:tblGrid>
       <w:tr>
-        <w:tblPrEx>
-          <w:tblCellMar>
-            <w:top w:w="0" w:type="dxa"/>
-            <w:bottom w:w="0" w:type="dxa"/>
-          </w:tblCellMar>
-        </w:tblPrEx>
         <w:tc>
           <w:tcPr>
             <w:tcW w:w="2600" w:type="dxa"/>
@@ -8171,12 +7583,6 @@
         </w:tc>
       </w:tr>
       <w:tr>
-        <w:tblPrEx>
-          <w:tblCellMar>
-            <w:top w:w="0" w:type="dxa"/>
-            <w:bottom w:w="0" w:type="dxa"/>
-          </w:tblCellMar>
-        </w:tblPrEx>
         <w:tc>
           <w:tcPr>
             <w:tcW w:w="2600" w:type="dxa"/>
@@ -8233,12 +7639,6 @@
         </w:tc>
       </w:tr>
       <w:tr>
-        <w:tblPrEx>
-          <w:tblCellMar>
-            <w:top w:w="0" w:type="dxa"/>
-            <w:bottom w:w="0" w:type="dxa"/>
-          </w:tblCellMar>
-        </w:tblPrEx>
         <w:tc>
           <w:tcPr>
             <w:tcW w:w="2600" w:type="dxa"/>
@@ -8295,12 +7695,6 @@
         </w:tc>
       </w:tr>
       <w:tr>
-        <w:tblPrEx>
-          <w:tblCellMar>
-            <w:top w:w="0" w:type="dxa"/>
-            <w:bottom w:w="0" w:type="dxa"/>
-          </w:tblCellMar>
-        </w:tblPrEx>
         <w:tc>
           <w:tcPr>
             <w:tcW w:w="2600" w:type="dxa"/>
@@ -8357,12 +7751,6 @@
         </w:tc>
       </w:tr>
       <w:tr>
-        <w:tblPrEx>
-          <w:tblCellMar>
-            <w:top w:w="0" w:type="dxa"/>
-            <w:bottom w:w="0" w:type="dxa"/>
-          </w:tblCellMar>
-        </w:tblPrEx>
         <w:tc>
           <w:tcPr>
             <w:tcW w:w="2600" w:type="dxa"/>
@@ -8419,12 +7807,6 @@
         </w:tc>
       </w:tr>
       <w:tr>
-        <w:tblPrEx>
-          <w:tblCellMar>
-            <w:top w:w="0" w:type="dxa"/>
-            <w:bottom w:w="0" w:type="dxa"/>
-          </w:tblCellMar>
-        </w:tblPrEx>
         <w:tc>
           <w:tcPr>
             <w:tcW w:w="2600" w:type="dxa"/>
@@ -8481,12 +7863,6 @@
         </w:tc>
       </w:tr>
       <w:tr>
-        <w:tblPrEx>
-          <w:tblCellMar>
-            <w:top w:w="0" w:type="dxa"/>
-            <w:bottom w:w="0" w:type="dxa"/>
-          </w:tblCellMar>
-        </w:tblPrEx>
         <w:tc>
           <w:tcPr>
             <w:tcW w:w="2600" w:type="dxa"/>
@@ -8550,12 +7926,6 @@
         </w:tc>
       </w:tr>
       <w:tr>
-        <w:tblPrEx>
-          <w:tblCellMar>
-            <w:top w:w="0" w:type="dxa"/>
-            <w:bottom w:w="0" w:type="dxa"/>
-          </w:tblCellMar>
-        </w:tblPrEx>
         <w:tc>
           <w:tcPr>
             <w:tcW w:w="2600" w:type="dxa"/>
@@ -8613,12 +7983,6 @@
         </w:tc>
       </w:tr>
       <w:tr>
-        <w:tblPrEx>
-          <w:tblCellMar>
-            <w:top w:w="0" w:type="dxa"/>
-            <w:bottom w:w="0" w:type="dxa"/>
-          </w:tblCellMar>
-        </w:tblPrEx>
         <w:tc>
           <w:tcPr>
             <w:tcW w:w="2600" w:type="dxa"/>
@@ -8689,12 +8053,6 @@
         </w:tc>
       </w:tr>
       <w:tr>
-        <w:tblPrEx>
-          <w:tblCellMar>
-            <w:top w:w="0" w:type="dxa"/>
-            <w:bottom w:w="0" w:type="dxa"/>
-          </w:tblCellMar>
-        </w:tblPrEx>
         <w:tc>
           <w:tcPr>
             <w:tcW w:w="2600" w:type="dxa"/>
@@ -8751,12 +8109,6 @@
         </w:tc>
       </w:tr>
       <w:tr>
-        <w:tblPrEx>
-          <w:tblCellMar>
-            <w:top w:w="0" w:type="dxa"/>
-            <w:bottom w:w="0" w:type="dxa"/>
-          </w:tblCellMar>
-        </w:tblPrEx>
         <w:tc>
           <w:tcPr>
             <w:tcW w:w="2600" w:type="dxa"/>
@@ -8848,12 +8200,6 @@
         <w:gridCol w:w="6760"/>
       </w:tblGrid>
       <w:tr>
-        <w:tblPrEx>
-          <w:tblCellMar>
-            <w:top w:w="0" w:type="dxa"/>
-            <w:bottom w:w="0" w:type="dxa"/>
-          </w:tblCellMar>
-        </w:tblPrEx>
         <w:tc>
           <w:tcPr>
             <w:tcW w:w="2600" w:type="dxa"/>
@@ -8920,12 +8266,6 @@
         </w:tc>
       </w:tr>
       <w:tr>
-        <w:tblPrEx>
-          <w:tblCellMar>
-            <w:top w:w="0" w:type="dxa"/>
-            <w:bottom w:w="0" w:type="dxa"/>
-          </w:tblCellMar>
-        </w:tblPrEx>
         <w:tc>
           <w:tcPr>
             <w:tcW w:w="2600" w:type="dxa"/>
@@ -8982,12 +8322,6 @@
         </w:tc>
       </w:tr>
       <w:tr>
-        <w:tblPrEx>
-          <w:tblCellMar>
-            <w:top w:w="0" w:type="dxa"/>
-            <w:bottom w:w="0" w:type="dxa"/>
-          </w:tblCellMar>
-        </w:tblPrEx>
         <w:tc>
           <w:tcPr>
             <w:tcW w:w="2600" w:type="dxa"/>
@@ -9044,12 +8378,6 @@
         </w:tc>
       </w:tr>
       <w:tr>
-        <w:tblPrEx>
-          <w:tblCellMar>
-            <w:top w:w="0" w:type="dxa"/>
-            <w:bottom w:w="0" w:type="dxa"/>
-          </w:tblCellMar>
-        </w:tblPrEx>
         <w:tc>
           <w:tcPr>
             <w:tcW w:w="2600" w:type="dxa"/>
@@ -9106,12 +8434,6 @@
         </w:tc>
       </w:tr>
       <w:tr>
-        <w:tblPrEx>
-          <w:tblCellMar>
-            <w:top w:w="0" w:type="dxa"/>
-            <w:bottom w:w="0" w:type="dxa"/>
-          </w:tblCellMar>
-        </w:tblPrEx>
         <w:tc>
           <w:tcPr>
             <w:tcW w:w="2600" w:type="dxa"/>
@@ -9168,12 +8490,6 @@
         </w:tc>
       </w:tr>
       <w:tr>
-        <w:tblPrEx>
-          <w:tblCellMar>
-            <w:top w:w="0" w:type="dxa"/>
-            <w:bottom w:w="0" w:type="dxa"/>
-          </w:tblCellMar>
-        </w:tblPrEx>
         <w:tc>
           <w:tcPr>
             <w:tcW w:w="2600" w:type="dxa"/>
@@ -9230,12 +8546,6 @@
         </w:tc>
       </w:tr>
       <w:tr>
-        <w:tblPrEx>
-          <w:tblCellMar>
-            <w:top w:w="0" w:type="dxa"/>
-            <w:bottom w:w="0" w:type="dxa"/>
-          </w:tblCellMar>
-        </w:tblPrEx>
         <w:tc>
           <w:tcPr>
             <w:tcW w:w="2600" w:type="dxa"/>
@@ -9292,12 +8602,6 @@
         </w:tc>
       </w:tr>
       <w:tr>
-        <w:tblPrEx>
-          <w:tblCellMar>
-            <w:top w:w="0" w:type="dxa"/>
-            <w:bottom w:w="0" w:type="dxa"/>
-          </w:tblCellMar>
-        </w:tblPrEx>
         <w:tc>
           <w:tcPr>
             <w:tcW w:w="2600" w:type="dxa"/>
@@ -9354,12 +8658,6 @@
         </w:tc>
       </w:tr>
       <w:tr>
-        <w:tblPrEx>
-          <w:tblCellMar>
-            <w:top w:w="0" w:type="dxa"/>
-            <w:bottom w:w="0" w:type="dxa"/>
-          </w:tblCellMar>
-        </w:tblPrEx>
         <w:tc>
           <w:tcPr>
             <w:tcW w:w="2600" w:type="dxa"/>
@@ -9416,12 +8714,6 @@
         </w:tc>
       </w:tr>
       <w:tr>
-        <w:tblPrEx>
-          <w:tblCellMar>
-            <w:top w:w="0" w:type="dxa"/>
-            <w:bottom w:w="0" w:type="dxa"/>
-          </w:tblCellMar>
-        </w:tblPrEx>
         <w:tc>
           <w:tcPr>
             <w:tcW w:w="2600" w:type="dxa"/>
@@ -9478,12 +8770,6 @@
         </w:tc>
       </w:tr>
       <w:tr>
-        <w:tblPrEx>
-          <w:tblCellMar>
-            <w:top w:w="0" w:type="dxa"/>
-            <w:bottom w:w="0" w:type="dxa"/>
-          </w:tblCellMar>
-        </w:tblPrEx>
         <w:tc>
           <w:tcPr>
             <w:tcW w:w="2600" w:type="dxa"/>
@@ -9598,6 +8884,9 @@
         <w:spacing w:before="200"/>
       </w:pPr>
       <w:r>
+        <w:rPr>
+          <w:noProof/>
+        </w:rPr>
         <w:drawing>
           <wp:inline distT="0" distB="0" distL="0" distR="0" wp14:anchorId="192C4712" wp14:editId="349A6A17">
             <wp:extent cx="6172200" cy="2186940"/>
@@ -9659,6 +8948,9 @@
         <w:spacing w:before="200"/>
       </w:pPr>
       <w:r>
+        <w:rPr>
+          <w:noProof/>
+        </w:rPr>
         <w:drawing>
           <wp:inline distT="0" distB="0" distL="0" distR="0" wp14:anchorId="22B4851C" wp14:editId="56875B89">
             <wp:extent cx="6172200" cy="2145665"/>
@@ -9717,6 +9009,9 @@
     </w:p>
     <w:p>
       <w:r>
+        <w:rPr>
+          <w:noProof/>
+        </w:rPr>
         <w:lastRenderedPageBreak/>
         <w:drawing>
           <wp:inline distT="0" distB="0" distL="0" distR="0" wp14:anchorId="5C325E48" wp14:editId="01CDF2C6">
@@ -9811,12 +9106,6 @@
         <w:gridCol w:w="2160"/>
       </w:tblGrid>
       <w:tr>
-        <w:tblPrEx>
-          <w:tblCellMar>
-            <w:top w:w="0" w:type="dxa"/>
-            <w:bottom w:w="0" w:type="dxa"/>
-          </w:tblCellMar>
-        </w:tblPrEx>
         <w:tc>
           <w:tcPr>
             <w:tcW w:w="1200" w:type="dxa"/>
@@ -9979,12 +9268,6 @@
         </w:tc>
       </w:tr>
       <w:tr>
-        <w:tblPrEx>
-          <w:tblCellMar>
-            <w:top w:w="0" w:type="dxa"/>
-            <w:bottom w:w="0" w:type="dxa"/>
-          </w:tblCellMar>
-        </w:tblPrEx>
         <w:tc>
           <w:tcPr>
             <w:tcW w:w="1200" w:type="dxa"/>
@@ -10118,12 +9401,6 @@
         </w:tc>
       </w:tr>
       <w:tr>
-        <w:tblPrEx>
-          <w:tblCellMar>
-            <w:top w:w="0" w:type="dxa"/>
-            <w:bottom w:w="0" w:type="dxa"/>
-          </w:tblCellMar>
-        </w:tblPrEx>
         <w:tc>
           <w:tcPr>
             <w:tcW w:w="1200" w:type="dxa"/>
@@ -10257,12 +9534,6 @@
         </w:tc>
       </w:tr>
       <w:tr>
-        <w:tblPrEx>
-          <w:tblCellMar>
-            <w:top w:w="0" w:type="dxa"/>
-            <w:bottom w:w="0" w:type="dxa"/>
-          </w:tblCellMar>
-        </w:tblPrEx>
         <w:tc>
           <w:tcPr>
             <w:tcW w:w="1200" w:type="dxa"/>
@@ -10389,12 +9660,6 @@
         </w:tc>
       </w:tr>
       <w:tr>
-        <w:tblPrEx>
-          <w:tblCellMar>
-            <w:top w:w="0" w:type="dxa"/>
-            <w:bottom w:w="0" w:type="dxa"/>
-          </w:tblCellMar>
-        </w:tblPrEx>
         <w:tc>
           <w:tcPr>
             <w:tcW w:w="1200" w:type="dxa"/>
@@ -10521,12 +9786,6 @@
         </w:tc>
       </w:tr>
       <w:tr>
-        <w:tblPrEx>
-          <w:tblCellMar>
-            <w:top w:w="0" w:type="dxa"/>
-            <w:bottom w:w="0" w:type="dxa"/>
-          </w:tblCellMar>
-        </w:tblPrEx>
         <w:tc>
           <w:tcPr>
             <w:tcW w:w="1200" w:type="dxa"/>
@@ -10660,12 +9919,6 @@
         </w:tc>
       </w:tr>
       <w:tr>
-        <w:tblPrEx>
-          <w:tblCellMar>
-            <w:top w:w="0" w:type="dxa"/>
-            <w:bottom w:w="0" w:type="dxa"/>
-          </w:tblCellMar>
-        </w:tblPrEx>
         <w:tc>
           <w:tcPr>
             <w:tcW w:w="1200" w:type="dxa"/>
@@ -10799,12 +10052,6 @@
         </w:tc>
       </w:tr>
       <w:tr>
-        <w:tblPrEx>
-          <w:tblCellMar>
-            <w:top w:w="0" w:type="dxa"/>
-            <w:bottom w:w="0" w:type="dxa"/>
-          </w:tblCellMar>
-        </w:tblPrEx>
         <w:tc>
           <w:tcPr>
             <w:tcW w:w="1200" w:type="dxa"/>
@@ -10938,12 +10185,6 @@
         </w:tc>
       </w:tr>
       <w:tr>
-        <w:tblPrEx>
-          <w:tblCellMar>
-            <w:top w:w="0" w:type="dxa"/>
-            <w:bottom w:w="0" w:type="dxa"/>
-          </w:tblCellMar>
-        </w:tblPrEx>
         <w:tc>
           <w:tcPr>
             <w:tcW w:w="1200" w:type="dxa"/>
@@ -11077,12 +10318,6 @@
         </w:tc>
       </w:tr>
       <w:tr>
-        <w:tblPrEx>
-          <w:tblCellMar>
-            <w:top w:w="0" w:type="dxa"/>
-            <w:bottom w:w="0" w:type="dxa"/>
-          </w:tblCellMar>
-        </w:tblPrEx>
         <w:tc>
           <w:tcPr>
             <w:tcW w:w="1200" w:type="dxa"/>
@@ -11216,12 +10451,6 @@
         </w:tc>
       </w:tr>
       <w:tr>
-        <w:tblPrEx>
-          <w:tblCellMar>
-            <w:top w:w="0" w:type="dxa"/>
-            <w:bottom w:w="0" w:type="dxa"/>
-          </w:tblCellMar>
-        </w:tblPrEx>
         <w:tc>
           <w:tcPr>
             <w:tcW w:w="1200" w:type="dxa"/>
@@ -11355,12 +10584,6 @@
         </w:tc>
       </w:tr>
       <w:tr>
-        <w:tblPrEx>
-          <w:tblCellMar>
-            <w:top w:w="0" w:type="dxa"/>
-            <w:bottom w:w="0" w:type="dxa"/>
-          </w:tblCellMar>
-        </w:tblPrEx>
         <w:tc>
           <w:tcPr>
             <w:tcW w:w="1200" w:type="dxa"/>
@@ -11494,12 +10717,6 @@
         </w:tc>
       </w:tr>
       <w:tr>
-        <w:tblPrEx>
-          <w:tblCellMar>
-            <w:top w:w="0" w:type="dxa"/>
-            <w:bottom w:w="0" w:type="dxa"/>
-          </w:tblCellMar>
-        </w:tblPrEx>
         <w:tc>
           <w:tcPr>
             <w:tcW w:w="1200" w:type="dxa"/>
@@ -11633,12 +10850,6 @@
         </w:tc>
       </w:tr>
       <w:tr>
-        <w:tblPrEx>
-          <w:tblCellMar>
-            <w:top w:w="0" w:type="dxa"/>
-            <w:bottom w:w="0" w:type="dxa"/>
-          </w:tblCellMar>
-        </w:tblPrEx>
         <w:tc>
           <w:tcPr>
             <w:tcW w:w="1200" w:type="dxa"/>
@@ -11787,12 +10998,6 @@
         </w:tc>
       </w:tr>
       <w:tr>
-        <w:tblPrEx>
-          <w:tblCellMar>
-            <w:top w:w="0" w:type="dxa"/>
-            <w:bottom w:w="0" w:type="dxa"/>
-          </w:tblCellMar>
-        </w:tblPrEx>
         <w:tc>
           <w:tcPr>
             <w:tcW w:w="1200" w:type="dxa"/>
@@ -12427,12 +11632,6 @@
         <w:gridCol w:w="4960"/>
       </w:tblGrid>
       <w:tr>
-        <w:tblPrEx>
-          <w:tblCellMar>
-            <w:top w:w="0" w:type="dxa"/>
-            <w:bottom w:w="0" w:type="dxa"/>
-          </w:tblCellMar>
-        </w:tblPrEx>
         <w:tc>
           <w:tcPr>
             <w:tcW w:w="2200" w:type="dxa"/>
@@ -12531,12 +11730,6 @@
         </w:tc>
       </w:tr>
       <w:tr>
-        <w:tblPrEx>
-          <w:tblCellMar>
-            <w:top w:w="0" w:type="dxa"/>
-            <w:bottom w:w="0" w:type="dxa"/>
-          </w:tblCellMar>
-        </w:tblPrEx>
         <w:tc>
           <w:tcPr>
             <w:tcW w:w="2200" w:type="dxa"/>
@@ -12561,197 +11754,251 @@
                 <w:bCs/>
                 <w:color w:val="000000"/>
               </w:rPr>
-              <w:t>Anoushay Fatima (24L-2585)</w:t>
-            </w:r>
-          </w:p>
-        </w:tc>
-        <w:tc>
-          <w:tcPr>
-            <w:tcW w:w="2200" w:type="dxa"/>
-            <w:tcBorders>
-              <w:top w:val="single" w:sz="1" w:space="0" w:color="CCCCCC"/>
-              <w:left w:val="single" w:sz="1" w:space="0" w:color="CCCCCC"/>
-              <w:bottom w:val="single" w:sz="1" w:space="0" w:color="CCCCCC"/>
-              <w:right w:val="single" w:sz="1" w:space="0" w:color="CCCCCC"/>
-            </w:tcBorders>
-            <w:tcMar>
-              <w:top w:w="100" w:type="dxa"/>
-              <w:left w:w="120" w:type="dxa"/>
-              <w:bottom w:w="100" w:type="dxa"/>
-              <w:right w:w="120" w:type="dxa"/>
-            </w:tcMar>
-            <w:vAlign w:val="center"/>
-          </w:tcPr>
-          <w:p>
-            <w:r>
-              <w:rPr>
-                <w:color w:val="000000"/>
-              </w:rPr>
-              <w:t>Project Lead + Requirements Engineer</w:t>
-            </w:r>
-          </w:p>
-        </w:tc>
-        <w:tc>
-          <w:tcPr>
-            <w:tcW w:w="4960" w:type="dxa"/>
-            <w:tcBorders>
-              <w:top w:val="single" w:sz="1" w:space="0" w:color="CCCCCC"/>
-              <w:left w:val="single" w:sz="1" w:space="0" w:color="CCCCCC"/>
-              <w:bottom w:val="single" w:sz="1" w:space="0" w:color="CCCCCC"/>
-              <w:right w:val="single" w:sz="1" w:space="0" w:color="CCCCCC"/>
-            </w:tcBorders>
-            <w:tcMar>
-              <w:top w:w="100" w:type="dxa"/>
-              <w:left w:w="120" w:type="dxa"/>
-              <w:bottom w:w="100" w:type="dxa"/>
-              <w:right w:w="120" w:type="dxa"/>
-            </w:tcMar>
-            <w:vAlign w:val="center"/>
-          </w:tcPr>
-          <w:p>
-            <w:r>
-              <w:rPr>
-                <w:color w:val="000000"/>
-              </w:rPr>
-              <w:t>Sprint planning, user story writing, structured specifications (SS-01, SS-02), NFR documentation, sprint backlog setup on Trello, burn-down chart, report compilation and formatting.</w:t>
-            </w:r>
-          </w:p>
-        </w:tc>
-      </w:tr>
-      <w:tr>
-        <w:tblPrEx>
-          <w:tblCellMar>
-            <w:top w:w="0" w:type="dxa"/>
-            <w:bottom w:w="0" w:type="dxa"/>
-          </w:tblCellMar>
-        </w:tblPrEx>
-        <w:tc>
-          <w:tcPr>
-            <w:tcW w:w="2200" w:type="dxa"/>
-            <w:tcBorders>
-              <w:top w:val="single" w:sz="1" w:space="0" w:color="CCCCCC"/>
-              <w:left w:val="single" w:sz="1" w:space="0" w:color="CCCCCC"/>
-              <w:bottom w:val="single" w:sz="1" w:space="0" w:color="CCCCCC"/>
-              <w:right w:val="single" w:sz="1" w:space="0" w:color="CCCCCC"/>
-            </w:tcBorders>
-            <w:tcMar>
-              <w:top w:w="100" w:type="dxa"/>
-              <w:left w:w="120" w:type="dxa"/>
-              <w:bottom w:w="100" w:type="dxa"/>
-              <w:right w:w="120" w:type="dxa"/>
-            </w:tcMar>
-            <w:vAlign w:val="center"/>
-          </w:tcPr>
-          <w:p>
+              <w:t>A</w:t>
+            </w:r>
             <w:r>
               <w:rPr>
                 <w:b/>
                 <w:bCs/>
                 <w:color w:val="000000"/>
               </w:rPr>
-              <w:t>Eman Adil (24L-2589)</w:t>
-            </w:r>
-          </w:p>
-        </w:tc>
-        <w:tc>
-          <w:tcPr>
-            <w:tcW w:w="2200" w:type="dxa"/>
-            <w:tcBorders>
-              <w:top w:val="single" w:sz="1" w:space="0" w:color="CCCCCC"/>
-              <w:left w:val="single" w:sz="1" w:space="0" w:color="CCCCCC"/>
-              <w:bottom w:val="single" w:sz="1" w:space="0" w:color="CCCCCC"/>
-              <w:right w:val="single" w:sz="1" w:space="0" w:color="CCCCCC"/>
-            </w:tcBorders>
-            <w:tcMar>
-              <w:top w:w="100" w:type="dxa"/>
-              <w:left w:w="120" w:type="dxa"/>
-              <w:bottom w:w="100" w:type="dxa"/>
-              <w:right w:w="120" w:type="dxa"/>
-            </w:tcMar>
-            <w:vAlign w:val="center"/>
-          </w:tcPr>
-          <w:p>
-            <w:r>
-              <w:rPr>
-                <w:color w:val="000000"/>
-              </w:rPr>
-              <w:t>Backend + Database Developer</w:t>
-            </w:r>
-          </w:p>
-        </w:tc>
-        <w:tc>
-          <w:tcPr>
-            <w:tcW w:w="4960" w:type="dxa"/>
-            <w:tcBorders>
-              <w:top w:val="single" w:sz="1" w:space="0" w:color="CCCCCC"/>
-              <w:left w:val="single" w:sz="1" w:space="0" w:color="CCCCCC"/>
-              <w:bottom w:val="single" w:sz="1" w:space="0" w:color="CCCCCC"/>
-              <w:right w:val="single" w:sz="1" w:space="0" w:color="CCCCCC"/>
-            </w:tcBorders>
-            <w:tcMar>
-              <w:top w:w="100" w:type="dxa"/>
-              <w:left w:w="120" w:type="dxa"/>
-              <w:bottom w:w="100" w:type="dxa"/>
-              <w:right w:w="120" w:type="dxa"/>
-            </w:tcMar>
-            <w:vAlign w:val="center"/>
-          </w:tcPr>
-          <w:p>
-            <w:r>
-              <w:rPr>
-                <w:color w:val="000000"/>
-              </w:rPr>
-              <w:t xml:space="preserve">Database schema design (User, </w:t>
-            </w:r>
-            <w:proofErr w:type="spellStart"/>
-            <w:r>
-              <w:rPr>
-                <w:color w:val="000000"/>
-              </w:rPr>
-              <w:t>QuizResponse</w:t>
-            </w:r>
-            <w:proofErr w:type="spellEnd"/>
-            <w:r>
-              <w:rPr>
-                <w:color w:val="000000"/>
-              </w:rPr>
-              <w:t>, Palette tables), API development (registration, login, quiz submission, palette generation endpoints), JWT authentication implementation, quiz scoring algorithm.</w:t>
-            </w:r>
-          </w:p>
-        </w:tc>
-      </w:tr>
-      <w:tr>
-        <w:tblPrEx>
-          <w:tblCellMar>
-            <w:top w:w="0" w:type="dxa"/>
-            <w:bottom w:w="0" w:type="dxa"/>
-          </w:tblCellMar>
-        </w:tblPrEx>
-        <w:tc>
-          <w:tcPr>
-            <w:tcW w:w="2200" w:type="dxa"/>
-            <w:tcBorders>
-              <w:top w:val="single" w:sz="1" w:space="0" w:color="CCCCCC"/>
-              <w:left w:val="single" w:sz="1" w:space="0" w:color="CCCCCC"/>
-              <w:bottom w:val="single" w:sz="1" w:space="0" w:color="CCCCCC"/>
-              <w:right w:val="single" w:sz="1" w:space="0" w:color="CCCCCC"/>
-            </w:tcBorders>
-            <w:tcMar>
-              <w:top w:w="100" w:type="dxa"/>
-              <w:left w:w="120" w:type="dxa"/>
-              <w:bottom w:w="100" w:type="dxa"/>
-              <w:right w:w="120" w:type="dxa"/>
-            </w:tcMar>
-            <w:vAlign w:val="center"/>
-          </w:tcPr>
-          <w:p>
+              <w:t>yza Ahmed</w:t>
+            </w:r>
             <w:r>
               <w:rPr>
                 <w:b/>
                 <w:bCs/>
                 <w:color w:val="000000"/>
               </w:rPr>
-              <w:t>Ayza Ahmed (24L-2577)</w:t>
+              <w:t>(24L-25</w:t>
+            </w:r>
+            <w:r>
+              <w:rPr>
+                <w:b/>
+                <w:bCs/>
+                <w:color w:val="000000"/>
+              </w:rPr>
+              <w:t>77</w:t>
+            </w:r>
+            <w:r>
+              <w:rPr>
+                <w:b/>
+                <w:bCs/>
+                <w:color w:val="000000"/>
+              </w:rPr>
+              <w:t>)</w:t>
+            </w:r>
+          </w:p>
+        </w:tc>
+        <w:tc>
+          <w:tcPr>
+            <w:tcW w:w="2200" w:type="dxa"/>
+            <w:tcBorders>
+              <w:top w:val="single" w:sz="1" w:space="0" w:color="CCCCCC"/>
+              <w:left w:val="single" w:sz="1" w:space="0" w:color="CCCCCC"/>
+              <w:bottom w:val="single" w:sz="1" w:space="0" w:color="CCCCCC"/>
+              <w:right w:val="single" w:sz="1" w:space="0" w:color="CCCCCC"/>
+            </w:tcBorders>
+            <w:tcMar>
+              <w:top w:w="100" w:type="dxa"/>
+              <w:left w:w="120" w:type="dxa"/>
+              <w:bottom w:w="100" w:type="dxa"/>
+              <w:right w:w="120" w:type="dxa"/>
+            </w:tcMar>
+            <w:vAlign w:val="center"/>
+          </w:tcPr>
+          <w:p>
+            <w:r>
+              <w:rPr>
+                <w:color w:val="000000"/>
+              </w:rPr>
+              <w:t>Project Lead + Requirements Engineer</w:t>
+            </w:r>
+          </w:p>
+        </w:tc>
+        <w:tc>
+          <w:tcPr>
+            <w:tcW w:w="4960" w:type="dxa"/>
+            <w:tcBorders>
+              <w:top w:val="single" w:sz="1" w:space="0" w:color="CCCCCC"/>
+              <w:left w:val="single" w:sz="1" w:space="0" w:color="CCCCCC"/>
+              <w:bottom w:val="single" w:sz="1" w:space="0" w:color="CCCCCC"/>
+              <w:right w:val="single" w:sz="1" w:space="0" w:color="CCCCCC"/>
+            </w:tcBorders>
+            <w:tcMar>
+              <w:top w:w="100" w:type="dxa"/>
+              <w:left w:w="120" w:type="dxa"/>
+              <w:bottom w:w="100" w:type="dxa"/>
+              <w:right w:w="120" w:type="dxa"/>
+            </w:tcMar>
+            <w:vAlign w:val="center"/>
+          </w:tcPr>
+          <w:p>
+            <w:r>
+              <w:rPr>
+                <w:color w:val="000000"/>
+              </w:rPr>
+              <w:t>Sprint planning, user story writing, structured specifications (SS-01, SS-02), NFR documentation, sprint backlog setup on Trello, burn-down chart, report compilation and formatting.</w:t>
+            </w:r>
+          </w:p>
+        </w:tc>
+      </w:tr>
+      <w:tr>
+        <w:tc>
+          <w:tcPr>
+            <w:tcW w:w="2200" w:type="dxa"/>
+            <w:tcBorders>
+              <w:top w:val="single" w:sz="1" w:space="0" w:color="CCCCCC"/>
+              <w:left w:val="single" w:sz="1" w:space="0" w:color="CCCCCC"/>
+              <w:bottom w:val="single" w:sz="1" w:space="0" w:color="CCCCCC"/>
+              <w:right w:val="single" w:sz="1" w:space="0" w:color="CCCCCC"/>
+            </w:tcBorders>
+            <w:tcMar>
+              <w:top w:w="100" w:type="dxa"/>
+              <w:left w:w="120" w:type="dxa"/>
+              <w:bottom w:w="100" w:type="dxa"/>
+              <w:right w:w="120" w:type="dxa"/>
+            </w:tcMar>
+            <w:vAlign w:val="center"/>
+          </w:tcPr>
+          <w:p>
+            <w:r>
+              <w:rPr>
+                <w:b/>
+                <w:bCs/>
+                <w:color w:val="000000"/>
+              </w:rPr>
+              <w:t>Eman Adil (24L-2589)</w:t>
+            </w:r>
+          </w:p>
+        </w:tc>
+        <w:tc>
+          <w:tcPr>
+            <w:tcW w:w="2200" w:type="dxa"/>
+            <w:tcBorders>
+              <w:top w:val="single" w:sz="1" w:space="0" w:color="CCCCCC"/>
+              <w:left w:val="single" w:sz="1" w:space="0" w:color="CCCCCC"/>
+              <w:bottom w:val="single" w:sz="1" w:space="0" w:color="CCCCCC"/>
+              <w:right w:val="single" w:sz="1" w:space="0" w:color="CCCCCC"/>
+            </w:tcBorders>
+            <w:tcMar>
+              <w:top w:w="100" w:type="dxa"/>
+              <w:left w:w="120" w:type="dxa"/>
+              <w:bottom w:w="100" w:type="dxa"/>
+              <w:right w:w="120" w:type="dxa"/>
+            </w:tcMar>
+            <w:vAlign w:val="center"/>
+          </w:tcPr>
+          <w:p>
+            <w:r>
+              <w:rPr>
+                <w:color w:val="000000"/>
+              </w:rPr>
+              <w:t>Backend + Database Developer</w:t>
+            </w:r>
+          </w:p>
+        </w:tc>
+        <w:tc>
+          <w:tcPr>
+            <w:tcW w:w="4960" w:type="dxa"/>
+            <w:tcBorders>
+              <w:top w:val="single" w:sz="1" w:space="0" w:color="CCCCCC"/>
+              <w:left w:val="single" w:sz="1" w:space="0" w:color="CCCCCC"/>
+              <w:bottom w:val="single" w:sz="1" w:space="0" w:color="CCCCCC"/>
+              <w:right w:val="single" w:sz="1" w:space="0" w:color="CCCCCC"/>
+            </w:tcBorders>
+            <w:tcMar>
+              <w:top w:w="100" w:type="dxa"/>
+              <w:left w:w="120" w:type="dxa"/>
+              <w:bottom w:w="100" w:type="dxa"/>
+              <w:right w:w="120" w:type="dxa"/>
+            </w:tcMar>
+            <w:vAlign w:val="center"/>
+          </w:tcPr>
+          <w:p>
+            <w:r>
+              <w:rPr>
+                <w:color w:val="000000"/>
+              </w:rPr>
+              <w:t xml:space="preserve">Database schema design (User, </w:t>
+            </w:r>
+            <w:proofErr w:type="spellStart"/>
+            <w:r>
+              <w:rPr>
+                <w:color w:val="000000"/>
+              </w:rPr>
+              <w:t>QuizResponse</w:t>
+            </w:r>
+            <w:proofErr w:type="spellEnd"/>
+            <w:r>
+              <w:rPr>
+                <w:color w:val="000000"/>
+              </w:rPr>
+              <w:t>, Palette tables), API development (registration, login, quiz submission, palette generation endpoints), JWT authentication implementation, quiz scoring algorithm.</w:t>
+            </w:r>
+          </w:p>
+        </w:tc>
+      </w:tr>
+      <w:tr>
+        <w:tc>
+          <w:tcPr>
+            <w:tcW w:w="2200" w:type="dxa"/>
+            <w:tcBorders>
+              <w:top w:val="single" w:sz="1" w:space="0" w:color="CCCCCC"/>
+              <w:left w:val="single" w:sz="1" w:space="0" w:color="CCCCCC"/>
+              <w:bottom w:val="single" w:sz="1" w:space="0" w:color="CCCCCC"/>
+              <w:right w:val="single" w:sz="1" w:space="0" w:color="CCCCCC"/>
+            </w:tcBorders>
+            <w:tcMar>
+              <w:top w:w="100" w:type="dxa"/>
+              <w:left w:w="120" w:type="dxa"/>
+              <w:bottom w:w="100" w:type="dxa"/>
+              <w:right w:w="120" w:type="dxa"/>
+            </w:tcMar>
+            <w:vAlign w:val="center"/>
+          </w:tcPr>
+          <w:p>
+            <w:proofErr w:type="spellStart"/>
+            <w:r>
+              <w:rPr>
+                <w:b/>
+                <w:bCs/>
+                <w:color w:val="000000"/>
+              </w:rPr>
+              <w:t>Annushay</w:t>
+            </w:r>
+            <w:proofErr w:type="spellEnd"/>
+            <w:r>
+              <w:rPr>
+                <w:b/>
+                <w:bCs/>
+                <w:color w:val="000000"/>
+              </w:rPr>
+              <w:t xml:space="preserve"> Fatima</w:t>
+            </w:r>
+            <w:r>
+              <w:rPr>
+                <w:b/>
+                <w:bCs/>
+                <w:color w:val="000000"/>
+              </w:rPr>
+              <w:t xml:space="preserve"> (24L-25</w:t>
+            </w:r>
+            <w:r>
+              <w:rPr>
+                <w:b/>
+                <w:bCs/>
+                <w:color w:val="000000"/>
+              </w:rPr>
+              <w:t>85</w:t>
+            </w:r>
+            <w:r>
+              <w:rPr>
+                <w:b/>
+                <w:bCs/>
+                <w:color w:val="000000"/>
+              </w:rPr>
+              <w:t>)</w:t>
             </w:r>
           </w:p>
         </w:tc>

</xml_diff>